<commit_message>
feat: add zero-data demo and supply-chain checks
</commit_message>
<xml_diff>
--- a/docs/PROJECT_MASTER_GUIDE_CN.docx
+++ b/docs/PROJECT_MASTER_GUIDE_CN.docx
@@ -13050,7 +13050,7 @@
         <w:rPr>
           <w:rFonts w:ascii="Microsoft YaHei" w:hAnsi="Microsoft YaHei" w:eastAsia="Microsoft YaHei"/>
         </w:rPr>
-        <w:t>74 条代码测试；</w:t>
+        <w:t>78 条代码测试；</w:t>
       </w:r>
     </w:p>
     <w:p>
@@ -13073,6 +13073,53 @@
           <w:rFonts w:ascii="Microsoft YaHei" w:hAnsi="Microsoft YaHei" w:eastAsia="Microsoft YaHei"/>
         </w:rPr>
         <w:t>GitHub Actions、Ruff、Mypy 核心类型门禁与本地全量质量脚本；</w:t>
+      </w:r>
+    </w:p>
+    <w:p>
+      <w:pPr>
+        <w:pStyle w:val="ListBullet"/>
+      </w:pPr>
+      <w:r>
+        <w:rPr>
+          <w:rFonts w:ascii="Microsoft YaHei" w:hAnsi="Microsoft YaHei" w:eastAsia="Microsoft YaHei"/>
+        </w:rPr>
+        <w:t>公开仓库零数据 Synthetic Demo，生成 42 条 ASR 与 14 条 NLU fixture，并与真实运行时完全隔离；</w:t>
+      </w:r>
+    </w:p>
+    <w:p>
+      <w:pPr>
+        <w:pStyle w:val="ListBullet"/>
+      </w:pPr>
+      <w:r>
+        <w:rPr>
+          <w:rFonts w:ascii="Microsoft YaHei" w:hAnsi="Microsoft YaHei" w:eastAsia="Microsoft YaHei"/>
+        </w:rPr>
+        <w:t>pip-audit 漏洞阻断、Dependabot 周期更新和 SECURITY 风险接受说明；</w:t>
+      </w:r>
+    </w:p>
+    <w:p>
+      <w:pPr>
+        <w:pStyle w:val="ListBullet"/>
+      </w:pPr>
+      <w:r>
+        <w:rPr>
+          <w:rFonts w:ascii="Microsoft YaHei" w:hAnsi="Microsoft YaHei" w:eastAsia="Microsoft YaHei"/>
+        </w:rPr>
+        <w:t xml:space="preserve">GitHub Actions 实际启动 Docker Demo 容器并校验 </w:t>
+      </w:r>
+      <w:r>
+        <w:rPr>
+          <w:rFonts w:ascii="Consolas" w:hAnsi="Consolas" w:eastAsia="Consolas"/>
+          <w:color w:val="65716B"/>
+          <w:sz w:val="18"/>
+        </w:rPr>
+        <w:t>/health</w:t>
+      </w:r>
+      <w:r>
+        <w:rPr>
+          <w:rFonts w:ascii="Microsoft YaHei" w:hAnsi="Microsoft YaHei" w:eastAsia="Microsoft YaHei"/>
+        </w:rPr>
+        <w:t xml:space="preserve"> 双 Provider 指标；</w:t>
       </w:r>
     </w:p>
     <w:p>
@@ -13443,7 +13490,7 @@
                 <w:rFonts w:ascii="Microsoft YaHei" w:hAnsi="Microsoft YaHei" w:eastAsia="Microsoft YaHei"/>
                 <w:sz w:val="17"/>
               </w:rPr>
-              <w:t>74/74 通过</w:t>
+              <w:t>78/78 通过</w:t>
             </w:r>
           </w:p>
         </w:tc>
@@ -15282,7 +15329,7 @@
         <w:rPr>
           <w:rFonts w:ascii="Microsoft YaHei" w:hAnsi="Microsoft YaHei" w:eastAsia="Microsoft YaHei"/>
         </w:rPr>
-        <w:t xml:space="preserve"> 当前接入 ASR 与 NLU 两个真实 Provider：92,301 条 ASR Case、104,897 条 NLU 汇总样本和 11,885 条 NLU 模型错误；识别 44 个 ASR 与 49 个 NLU 治理候选。74 条代码测试、25 条核心 Agent 回归、62 条合成银标、7 条 NLU/跨 Provider 回归和 18 条 Hybrid RAG 检索用例全部通过。Azure </w:t>
+        <w:t xml:space="preserve"> 当前接入 ASR 与 NLU 两个真实 Provider：92,301 条 ASR Case、104,897 条 NLU 汇总样本和 11,885 条 NLU 模型错误；识别 44 个 ASR 与 49 个 NLU 治理候选。78 条代码测试、25 条核心 Agent 回归、62 条合成银标、7 条 NLU/跨 Provider 回归和 18 条 Hybrid RAG 检索用例全部通过。Azure </w:t>
       </w:r>
       <w:r>
         <w:rPr>
@@ -15563,7 +15610,7 @@
                 <w:color w:val="65716B"/>
                 <w:sz w:val="17"/>
               </w:rPr>
-              <w:t>- 构建确定性评测与可选 Azure LLM-as-Judge 双轨体系，覆盖意图、实体、工具、Agent、答案、引用、Recall@K 和 MRR，并设置检索晋级门槛；通过 GitHub Actions、Ruff、Mypy、74 条测试和模型故障注入建立质量门禁，Azure Planner/Composer 异常时确定性降级并记录 Trace。</w:t>
+              <w:t>- 构建确定性评测与可选 Azure LLM-as-Judge 双轨体系，覆盖意图、实体、工具、Agent、答案、引用、Recall@K 和 MRR，并设置检索晋级门槛；通过 GitHub Actions、Ruff、Mypy、pip-audit、78 条测试和模型故障注入建立质量门禁，Azure Planner/Composer 异常时确定性降级并记录 Trace。</w:t>
             </w:r>
           </w:p>
         </w:tc>

</xml_diff>

<commit_message>
fix: resolve packaged runtime project root
</commit_message>
<xml_diff>
--- a/docs/PROJECT_MASTER_GUIDE_CN.docx
+++ b/docs/PROJECT_MASTER_GUIDE_CN.docx
@@ -13050,7 +13050,7 @@
         <w:rPr>
           <w:rFonts w:ascii="Microsoft YaHei" w:hAnsi="Microsoft YaHei" w:eastAsia="Microsoft YaHei"/>
         </w:rPr>
-        <w:t>78 条代码测试；</w:t>
+        <w:t>79 条代码测试；</w:t>
       </w:r>
     </w:p>
     <w:p>
@@ -13490,7 +13490,7 @@
                 <w:rFonts w:ascii="Microsoft YaHei" w:hAnsi="Microsoft YaHei" w:eastAsia="Microsoft YaHei"/>
                 <w:sz w:val="17"/>
               </w:rPr>
-              <w:t>78/78 通过</w:t>
+              <w:t>79/79 通过</w:t>
             </w:r>
           </w:p>
         </w:tc>
@@ -15329,7 +15329,7 @@
         <w:rPr>
           <w:rFonts w:ascii="Microsoft YaHei" w:hAnsi="Microsoft YaHei" w:eastAsia="Microsoft YaHei"/>
         </w:rPr>
-        <w:t xml:space="preserve"> 当前接入 ASR 与 NLU 两个真实 Provider：92,301 条 ASR Case、104,897 条 NLU 汇总样本和 11,885 条 NLU 模型错误；识别 44 个 ASR 与 49 个 NLU 治理候选。78 条代码测试、25 条核心 Agent 回归、62 条合成银标、7 条 NLU/跨 Provider 回归和 18 条 Hybrid RAG 检索用例全部通过。Azure </w:t>
+        <w:t xml:space="preserve"> 当前接入 ASR 与 NLU 两个真实 Provider：92,301 条 ASR Case、104,897 条 NLU 汇总样本和 11,885 条 NLU 模型错误；识别 44 个 ASR 与 49 个 NLU 治理候选。79 条代码测试、25 条核心 Agent 回归、62 条合成银标、7 条 NLU/跨 Provider 回归和 18 条 Hybrid RAG 检索用例全部通过。Azure </w:t>
       </w:r>
       <w:r>
         <w:rPr>
@@ -15610,7 +15610,7 @@
                 <w:color w:val="65716B"/>
                 <w:sz w:val="17"/>
               </w:rPr>
-              <w:t>- 构建确定性评测与可选 Azure LLM-as-Judge 双轨体系，覆盖意图、实体、工具、Agent、答案、引用、Recall@K 和 MRR，并设置检索晋级门槛；通过 GitHub Actions、Ruff、Mypy、pip-audit、78 条测试和模型故障注入建立质量门禁，Azure Planner/Composer 异常时确定性降级并记录 Trace。</w:t>
+              <w:t>- 构建确定性评测与可选 Azure LLM-as-Judge 双轨体系，覆盖意图、实体、工具、Agent、答案、引用、Recall@K 和 MRR，并设置检索晋级门槛；通过 GitHub Actions、Ruff、Mypy、pip-audit、79 条测试和模型故障注入建立质量门禁，Azure Planner/Composer 异常时确定性降级并记录 Trace。</w:t>
             </w:r>
           </w:p>
         </w:tc>

</xml_diff>